<commit_message>
Fix duplicate figure list audit
</commit_message>
<xml_diff>
--- a/skills/thesis-proposal-report-builder/assets/base-templates/proposal-template.docx
+++ b/skills/thesis-proposal-report-builder/assets/base-templates/proposal-template.docx
@@ -1394,93 +1394,9 @@
       <w:r>
         <w:fldChar w:fldCharType="separate"/>
       </w:r>
-      <w:hyperlink w:anchor="_Toc213752086" w:history="1">
-        <w:r>
-          <w:rPr>
-            <w:rStyle w:val="afb"/>
-            <w:noProof/>
-          </w:rPr>
-          <w:t>图</w:t>
-        </w:r>
-        <w:r>
-          <w:rPr>
-            <w:rStyle w:val="afb"/>
-            <w:noProof/>
-          </w:rPr>
-          <w:t>1</w:t>
-        </w:r>
-        <w:r>
-          <w:rPr>
-            <w:rStyle w:val="afb"/>
-            <w:rFonts w:ascii="黑体" w:eastAsia="黑体" w:hAnsi="黑体"/>
-            <w:noProof/>
-          </w:rPr>
-          <w:t xml:space="preserve">  研究内容关系示意图</w:t>
-        </w:r>
-        <w:r>
-          <w:rPr>
-            <w:noProof/>
-            <w:webHidden/>
-          </w:rPr>
-          <w:tab/>
-        </w:r>
-        <w:r>
-          <w:rPr>
-            <w:noProof/>
-            <w:webHidden/>
-          </w:rPr>
-          <w:fldChar w:fldCharType="begin"/>
-        </w:r>
-        <w:r>
-          <w:rPr>
-            <w:noProof/>
-            <w:webHidden/>
-          </w:rPr>
-          <w:instrText xml:space="preserve"> PAGEREF _Toc213752086 \h </w:instrText>
-        </w:r>
-        <w:r>
-          <w:rPr>
-            <w:noProof/>
-            <w:webHidden/>
-          </w:rPr>
-        </w:r>
-        <w:r>
-          <w:rPr>
-            <w:noProof/>
-            <w:webHidden/>
-          </w:rPr>
-          <w:fldChar w:fldCharType="separate"/>
-        </w:r>
-        <w:r>
-          <w:rPr>
-            <w:noProof/>
-            <w:webHidden/>
-          </w:rPr>
-          <w:t>1</w:t>
-        </w:r>
-        <w:r>
-          <w:rPr>
-            <w:noProof/>
-            <w:webHidden/>
-          </w:rPr>
-          <w:fldChar w:fldCharType="end"/>
-        </w:r>
-      </w:hyperlink>
-    </w:p>
-    <w:p ns2:paraId="7F9757F5" ns2:textId="35671082">
-      <w:pPr>
-        <w:sectPr>
-          <w:headerReference w:type="default" ns10:id="rId12"/>
-          <w:footerReference w:type="default" ns10:id="rId13"/>
-          <w:headerReference w:type="first" ns10:id="rId14"/>
-          <w:footerReference w:type="first" ns10:id="rId15"/>
-          <w:pgSz w:w="11906" w:h="16838" w:code="9"/>
-          <w:pgMar w:top="1928" w:right="1797" w:bottom="1928" w:left="1797" w:header="1588" w:footer="1588" w:gutter="0"/>
-          <w:pgNumType w:fmt="lowerRoman" w:start="1"/>
-          <w:cols w:space="425"/>
-          <w:docGrid w:type="lines" w:linePitch="326"/>
-        </w:sectPr>
-      </w:pPr>
+      <w:r>
+        <w:t>未找到图形项目表。</w:t>
+      </w:r>
       <w:r>
         <w:fldChar w:fldCharType="end"/>
       </w:r>

</xml_diff>